<commit_message>
fix controllergen for current build, edit domain model, edit erd schema, update doc, add migration, add gencontrollerviews
</commit_message>
<xml_diff>
--- a/Docs/production-manager-app-eng-v2024.docx
+++ b/Docs/production-manager-app-eng-v2024.docx
@@ -6487,10 +6487,10 @@
           <w:noProof/>
         </w:rPr>
         <w:drawing>
-          <wp:inline distT="0" distB="0" distL="0" distR="0" wp14:anchorId="004F39DF" wp14:editId="7A6BC506">
-            <wp:extent cx="8750300" cy="7569200"/>
-            <wp:effectExtent l="0" t="0" r="0" b="0"/>
-            <wp:docPr id="1110388320" name="Picture 1"/>
+          <wp:inline distT="0" distB="0" distL="0" distR="0" wp14:anchorId="14815E08" wp14:editId="23997B8B">
+            <wp:extent cx="10083800" cy="8380703"/>
+            <wp:effectExtent l="0" t="0" r="0" b="1905"/>
+            <wp:docPr id="1009065558" name="Picture 1" descr="A screenshot of a computer&#10;&#10;Description automatically generated"/>
             <wp:cNvGraphicFramePr>
               <a:graphicFrameLocks xmlns:a="http://schemas.openxmlformats.org/drawingml/2006/main" noChangeAspect="1"/>
             </wp:cNvGraphicFramePr>
@@ -6498,7 +6498,7 @@
               <a:graphicData uri="http://schemas.openxmlformats.org/drawingml/2006/picture">
                 <pic:pic xmlns:pic="http://schemas.openxmlformats.org/drawingml/2006/picture">
                   <pic:nvPicPr>
-                    <pic:cNvPr id="1110388320" name=""/>
+                    <pic:cNvPr id="1009065558" name="Picture 1" descr="A screenshot of a computer&#10;&#10;Description automatically generated"/>
                     <pic:cNvPicPr/>
                   </pic:nvPicPr>
                   <pic:blipFill>
@@ -6510,7 +6510,7 @@
                   <pic:spPr>
                     <a:xfrm>
                       <a:off x="0" y="0"/>
-                      <a:ext cx="8750300" cy="7569200"/>
+                      <a:ext cx="10092768" cy="8388157"/>
                     </a:xfrm>
                     <a:prstGeom prst="rect">
                       <a:avLst/>
@@ -6549,6 +6549,7 @@
       </w:pPr>
       <w:bookmarkStart w:id="26" w:name="_Toc159773156"/>
       <w:r>
+        <w:lastRenderedPageBreak/>
         <w:t>Annex</w:t>
       </w:r>
       <w:r>
@@ -8329,6 +8330,15 @@
           <w:szCs w:val="20"/>
         </w:rPr>
         <w:br/>
+      </w:r>
+      <w:r>
+        <w:rPr>
+          <w:rFonts w:ascii="Courier New" w:hAnsi="Courier New" w:cs="Courier New"/>
+          <w:color w:val="000000"/>
+          <w:sz w:val="20"/>
+          <w:szCs w:val="20"/>
+        </w:rPr>
+        <w:lastRenderedPageBreak/>
         <w:t xml:space="preserve">            </w:t>
       </w:r>
       <w:r>
@@ -9849,6 +9859,15 @@
           <w:szCs w:val="20"/>
         </w:rPr>
         <w:br/>
+      </w:r>
+      <w:r>
+        <w:rPr>
+          <w:rFonts w:ascii="Courier New" w:hAnsi="Courier New" w:cs="Courier New"/>
+          <w:color w:val="808080"/>
+          <w:sz w:val="20"/>
+          <w:szCs w:val="20"/>
+        </w:rPr>
+        <w:lastRenderedPageBreak/>
         <w:t xml:space="preserve">        </w:t>
       </w:r>
       <w:r>

</xml_diff>